<commit_message>
Missing Answers And Feedback Resubmission
</commit_message>
<xml_diff>
--- a/ZOMATO RESTAURANT ANALYSIS.docx
+++ b/ZOMATO RESTAURANT ANALYSIS.docx
@@ -157,7 +157,23 @@
           <w:sz w:val="24"/>
           <w:szCs w:val="24"/>
         </w:rPr>
-        <w:t>Using the LookUp functions, fill up the countries in the original data using the country code.</w:t>
+        <w:t xml:space="preserve">Using the </w:t>
+      </w:r>
+      <w:proofErr w:type="spellStart"/>
+      <w:r>
+        <w:rPr>
+          <w:sz w:val="24"/>
+          <w:szCs w:val="24"/>
+        </w:rPr>
+        <w:t>LookUp</w:t>
+      </w:r>
+      <w:proofErr w:type="spellEnd"/>
+      <w:r>
+        <w:rPr>
+          <w:sz w:val="24"/>
+          <w:szCs w:val="24"/>
+        </w:rPr>
+        <w:t xml:space="preserve"> functions, fill up the countries in the original data using the country code.</w:t>
       </w:r>
     </w:p>
     <w:p>
@@ -2787,6 +2803,7 @@
                 <w14:ligatures w14:val="none"/>
               </w:rPr>
             </w:pPr>
+            <w:proofErr w:type="spellStart"/>
             <w:r>
               <w:rPr>
                 <w:rFonts w:ascii="Verdana" w:eastAsia="Times New Roman" w:hAnsi="Verdana" w:cs="Times New Roman"/>
@@ -2797,6 +2814,7 @@
               </w:rPr>
               <w:t>Penola</w:t>
             </w:r>
+            <w:proofErr w:type="spellEnd"/>
           </w:p>
         </w:tc>
         <w:tc>
@@ -3119,8 +3137,20 @@
                 <w:lang w:eastAsia="en-IN" w:bidi="hi-IN"/>
                 <w14:ligatures w14:val="none"/>
               </w:rPr>
-              <w:t>Victor Harbor</w:t>
-            </w:r>
+              <w:t xml:space="preserve">Victor </w:t>
+            </w:r>
+            <w:proofErr w:type="spellStart"/>
+            <w:r>
+              <w:rPr>
+                <w:rFonts w:ascii="Verdana" w:eastAsia="Times New Roman" w:hAnsi="Verdana" w:cs="Times New Roman"/>
+                <w:color w:val="005975"/>
+                <w:kern w:val="0"/>
+                <w:lang w:eastAsia="en-IN" w:bidi="hi-IN"/>
+                <w14:ligatures w14:val="none"/>
+              </w:rPr>
+              <w:t>Harbor</w:t>
+            </w:r>
+            <w:proofErr w:type="spellEnd"/>
           </w:p>
         </w:tc>
         <w:tc>
@@ -3273,6 +3303,7 @@
                 <w14:ligatures w14:val="none"/>
               </w:rPr>
             </w:pPr>
+            <w:proofErr w:type="spellStart"/>
             <w:r>
               <w:rPr>
                 <w:rFonts w:ascii="Verdana" w:eastAsia="Times New Roman" w:hAnsi="Verdana" w:cs="Times New Roman"/>
@@ -3283,6 +3314,7 @@
               </w:rPr>
               <w:t>Lorn</w:t>
             </w:r>
+            <w:proofErr w:type="spellEnd"/>
           </w:p>
         </w:tc>
         <w:tc>
@@ -4729,7 +4761,39 @@
           <w:sz w:val="24"/>
           <w:szCs w:val="24"/>
         </w:rPr>
-        <w:t>Australia: Lorn, Lakes Entrance, Victor Harber, Inverloch</w:t>
+        <w:t xml:space="preserve">Australia: </w:t>
+      </w:r>
+      <w:proofErr w:type="spellStart"/>
+      <w:r>
+        <w:rPr>
+          <w:sz w:val="24"/>
+          <w:szCs w:val="24"/>
+        </w:rPr>
+        <w:t>Lorn</w:t>
+      </w:r>
+      <w:proofErr w:type="spellEnd"/>
+      <w:r>
+        <w:rPr>
+          <w:sz w:val="24"/>
+          <w:szCs w:val="24"/>
+        </w:rPr>
+        <w:t xml:space="preserve">, Lakes Entrance, Victor </w:t>
+      </w:r>
+      <w:proofErr w:type="spellStart"/>
+      <w:r>
+        <w:rPr>
+          <w:sz w:val="24"/>
+          <w:szCs w:val="24"/>
+        </w:rPr>
+        <w:t>Harber</w:t>
+      </w:r>
+      <w:proofErr w:type="spellEnd"/>
+      <w:r>
+        <w:rPr>
+          <w:sz w:val="24"/>
+          <w:szCs w:val="24"/>
+        </w:rPr>
+        <w:t>, Inverloch</w:t>
       </w:r>
     </w:p>
     <w:p>
@@ -4749,7 +4813,23 @@
           <w:sz w:val="24"/>
           <w:szCs w:val="24"/>
         </w:rPr>
-        <w:t>Philippines: Quezon City, Tagaytay City, SanJuan City, Santa Rosa, Makati City</w:t>
+        <w:t xml:space="preserve">Philippines: Quezon City, Tagaytay City, </w:t>
+      </w:r>
+      <w:proofErr w:type="spellStart"/>
+      <w:r>
+        <w:rPr>
+          <w:sz w:val="24"/>
+          <w:szCs w:val="24"/>
+        </w:rPr>
+        <w:t>SanJuan</w:t>
+      </w:r>
+      <w:proofErr w:type="spellEnd"/>
+      <w:r>
+        <w:rPr>
+          <w:sz w:val="24"/>
+          <w:szCs w:val="24"/>
+        </w:rPr>
+        <w:t xml:space="preserve"> City, Santa Rosa, Makati City</w:t>
       </w:r>
     </w:p>
     <w:p>
@@ -5866,6 +5946,7 @@
                 <w14:ligatures w14:val="none"/>
               </w:rPr>
             </w:pPr>
+            <w:proofErr w:type="spellStart"/>
             <w:r>
               <w:rPr>
                 <w:rFonts w:ascii="Calibri" w:eastAsia="Times New Roman" w:hAnsi="Calibri" w:cs="Calibri"/>
@@ -5880,6 +5961,7 @@
               </w:rPr>
               <w:t>RestaurantName</w:t>
             </w:r>
+            <w:proofErr w:type="spellEnd"/>
           </w:p>
         </w:tc>
         <w:tc>
@@ -5956,6 +6038,7 @@
                 <w14:ligatures w14:val="none"/>
               </w:rPr>
             </w:pPr>
+            <w:proofErr w:type="spellStart"/>
             <w:r>
               <w:rPr>
                 <w:rFonts w:ascii="Calibri" w:eastAsia="Times New Roman" w:hAnsi="Calibri" w:cs="Calibri"/>
@@ -5970,6 +6053,7 @@
               </w:rPr>
               <w:t>Price_range</w:t>
             </w:r>
+            <w:proofErr w:type="spellEnd"/>
           </w:p>
         </w:tc>
         <w:tc>
@@ -6001,6 +6085,7 @@
                 <w14:ligatures w14:val="none"/>
               </w:rPr>
             </w:pPr>
+            <w:proofErr w:type="spellStart"/>
             <w:r>
               <w:rPr>
                 <w:rFonts w:ascii="Calibri" w:eastAsia="Times New Roman" w:hAnsi="Calibri" w:cs="Calibri"/>
@@ -6015,6 +6100,7 @@
               </w:rPr>
               <w:t>Average_Cost_for_two</w:t>
             </w:r>
+            <w:proofErr w:type="spellEnd"/>
           </w:p>
         </w:tc>
         <w:tc>
@@ -6647,17 +6733,31 @@
                 <w14:ligatures w14:val="none"/>
               </w:rPr>
             </w:pPr>
-            <w:r>
-              <w:rPr>
-                <w:rFonts w:ascii="Calibri" w:eastAsia="Times New Roman" w:hAnsi="Calibri" w:cs="Calibri"/>
-                <w:color w:val="005975"/>
-                <w:kern w:val="0"/>
-                <w:sz w:val="24"/>
-                <w:szCs w:val="24"/>
-                <w:lang w:eastAsia="en-IN" w:bidi="hi-IN"/>
-                <w14:ligatures w14:val="none"/>
-              </w:rPr>
-              <w:t>Arigato Sushi</w:t>
+            <w:proofErr w:type="spellStart"/>
+            <w:r>
+              <w:rPr>
+                <w:rFonts w:ascii="Calibri" w:eastAsia="Times New Roman" w:hAnsi="Calibri" w:cs="Calibri"/>
+                <w:color w:val="005975"/>
+                <w:kern w:val="0"/>
+                <w:sz w:val="24"/>
+                <w:szCs w:val="24"/>
+                <w:lang w:eastAsia="en-IN" w:bidi="hi-IN"/>
+                <w14:ligatures w14:val="none"/>
+              </w:rPr>
+              <w:t>Arigato</w:t>
+            </w:r>
+            <w:proofErr w:type="spellEnd"/>
+            <w:r>
+              <w:rPr>
+                <w:rFonts w:ascii="Calibri" w:eastAsia="Times New Roman" w:hAnsi="Calibri" w:cs="Calibri"/>
+                <w:color w:val="005975"/>
+                <w:kern w:val="0"/>
+                <w:sz w:val="24"/>
+                <w:szCs w:val="24"/>
+                <w:lang w:eastAsia="en-IN" w:bidi="hi-IN"/>
+                <w14:ligatures w14:val="none"/>
+              </w:rPr>
+              <w:t xml:space="preserve"> Sushi</w:t>
             </w:r>
           </w:p>
         </w:tc>
@@ -7149,7 +7249,23 @@
           <w:sz w:val="24"/>
           <w:szCs w:val="24"/>
         </w:rPr>
-        <w:t>In Canada, Tokyo Sushi, Arigato Sushi and Consort Restaurant are our biggest competitors as they have less average cost of food and also they have Good Ratings.</w:t>
+        <w:t xml:space="preserve">In Canada, Tokyo Sushi, </w:t>
+      </w:r>
+      <w:proofErr w:type="spellStart"/>
+      <w:r>
+        <w:rPr>
+          <w:sz w:val="24"/>
+          <w:szCs w:val="24"/>
+        </w:rPr>
+        <w:t>Arigato</w:t>
+      </w:r>
+      <w:proofErr w:type="spellEnd"/>
+      <w:r>
+        <w:rPr>
+          <w:sz w:val="24"/>
+          <w:szCs w:val="24"/>
+        </w:rPr>
+        <w:t xml:space="preserve"> Sushi and Consort Restaurant are our biggest competitors as they have less average cost of food and also they have Good Ratings.</w:t>
       </w:r>
     </w:p>
     <w:p>
@@ -7243,6 +7359,7 @@
                 <w14:ligatures w14:val="none"/>
               </w:rPr>
             </w:pPr>
+            <w:proofErr w:type="spellStart"/>
             <w:r>
               <w:rPr>
                 <w:rFonts w:ascii="Calibri" w:eastAsia="Times New Roman" w:hAnsi="Calibri" w:cs="Calibri"/>
@@ -7257,6 +7374,7 @@
               </w:rPr>
               <w:t>RestaurantName</w:t>
             </w:r>
+            <w:proofErr w:type="spellEnd"/>
           </w:p>
         </w:tc>
         <w:tc>
@@ -7333,6 +7451,7 @@
                 <w14:ligatures w14:val="none"/>
               </w:rPr>
             </w:pPr>
+            <w:proofErr w:type="spellStart"/>
             <w:r>
               <w:rPr>
                 <w:rFonts w:ascii="Calibri" w:eastAsia="Times New Roman" w:hAnsi="Calibri" w:cs="Calibri"/>
@@ -7347,6 +7466,7 @@
               </w:rPr>
               <w:t>Price_range</w:t>
             </w:r>
+            <w:proofErr w:type="spellEnd"/>
           </w:p>
         </w:tc>
         <w:tc>
@@ -7378,6 +7498,7 @@
                 <w14:ligatures w14:val="none"/>
               </w:rPr>
             </w:pPr>
+            <w:proofErr w:type="spellStart"/>
             <w:r>
               <w:rPr>
                 <w:rFonts w:ascii="Calibri" w:eastAsia="Times New Roman" w:hAnsi="Calibri" w:cs="Calibri"/>
@@ -7392,6 +7513,7 @@
               </w:rPr>
               <w:t>Average_Cost_for_two</w:t>
             </w:r>
+            <w:proofErr w:type="spellEnd"/>
           </w:p>
         </w:tc>
         <w:tc>
@@ -8617,6 +8739,7 @@
                 <w14:ligatures w14:val="none"/>
               </w:rPr>
             </w:pPr>
+            <w:proofErr w:type="spellStart"/>
             <w:r>
               <w:rPr>
                 <w:rFonts w:ascii="Calibri" w:eastAsia="Times New Roman" w:hAnsi="Calibri" w:cs="Calibri"/>
@@ -8631,6 +8754,7 @@
               </w:rPr>
               <w:t>RestaurantName</w:t>
             </w:r>
+            <w:proofErr w:type="spellEnd"/>
           </w:p>
         </w:tc>
         <w:tc>
@@ -8707,6 +8831,7 @@
                 <w14:ligatures w14:val="none"/>
               </w:rPr>
             </w:pPr>
+            <w:proofErr w:type="spellStart"/>
             <w:r>
               <w:rPr>
                 <w:rFonts w:ascii="Calibri" w:eastAsia="Times New Roman" w:hAnsi="Calibri" w:cs="Calibri"/>
@@ -8721,6 +8846,7 @@
               </w:rPr>
               <w:t>Price_range</w:t>
             </w:r>
+            <w:proofErr w:type="spellEnd"/>
           </w:p>
         </w:tc>
         <w:tc>
@@ -8752,6 +8878,7 @@
                 <w14:ligatures w14:val="none"/>
               </w:rPr>
             </w:pPr>
+            <w:proofErr w:type="spellStart"/>
             <w:r>
               <w:rPr>
                 <w:rFonts w:ascii="Calibri" w:eastAsia="Times New Roman" w:hAnsi="Calibri" w:cs="Calibri"/>
@@ -8766,6 +8893,7 @@
               </w:rPr>
               <w:t>Average_Cost_for_two</w:t>
             </w:r>
+            <w:proofErr w:type="spellEnd"/>
           </w:p>
         </w:tc>
         <w:tc>
@@ -8890,17 +9018,31 @@
                 <w14:ligatures w14:val="none"/>
               </w:rPr>
             </w:pPr>
-            <w:r>
-              <w:rPr>
-                <w:rFonts w:ascii="Calibri" w:eastAsia="Times New Roman" w:hAnsi="Calibri" w:cs="Calibri"/>
-                <w:color w:val="005975"/>
-                <w:kern w:val="0"/>
-                <w:sz w:val="24"/>
-                <w:szCs w:val="24"/>
-                <w:lang w:eastAsia="en-IN" w:bidi="hi-IN"/>
-                <w14:ligatures w14:val="none"/>
-              </w:rPr>
-              <w:t>Hobing Korean Dessert Cafe</w:t>
+            <w:proofErr w:type="spellStart"/>
+            <w:r>
+              <w:rPr>
+                <w:rFonts w:ascii="Calibri" w:eastAsia="Times New Roman" w:hAnsi="Calibri" w:cs="Calibri"/>
+                <w:color w:val="005975"/>
+                <w:kern w:val="0"/>
+                <w:sz w:val="24"/>
+                <w:szCs w:val="24"/>
+                <w:lang w:eastAsia="en-IN" w:bidi="hi-IN"/>
+                <w14:ligatures w14:val="none"/>
+              </w:rPr>
+              <w:t>Hobing</w:t>
+            </w:r>
+            <w:proofErr w:type="spellEnd"/>
+            <w:r>
+              <w:rPr>
+                <w:rFonts w:ascii="Calibri" w:eastAsia="Times New Roman" w:hAnsi="Calibri" w:cs="Calibri"/>
+                <w:color w:val="005975"/>
+                <w:kern w:val="0"/>
+                <w:sz w:val="24"/>
+                <w:szCs w:val="24"/>
+                <w:lang w:eastAsia="en-IN" w:bidi="hi-IN"/>
+                <w14:ligatures w14:val="none"/>
+              </w:rPr>
+              <w:t xml:space="preserve"> Korean Dessert Cafe</w:t>
             </w:r>
           </w:p>
         </w:tc>
@@ -9144,17 +9286,31 @@
                 <w14:ligatures w14:val="none"/>
               </w:rPr>
             </w:pPr>
-            <w:r>
-              <w:rPr>
-                <w:rFonts w:ascii="Calibri" w:eastAsia="Times New Roman" w:hAnsi="Calibri" w:cs="Calibri"/>
-                <w:color w:val="005975"/>
-                <w:kern w:val="0"/>
-                <w:sz w:val="24"/>
-                <w:szCs w:val="24"/>
-                <w:lang w:eastAsia="en-IN" w:bidi="hi-IN"/>
-                <w14:ligatures w14:val="none"/>
-              </w:rPr>
-              <w:t>Sodam Korean Restaurant</w:t>
+            <w:proofErr w:type="spellStart"/>
+            <w:r>
+              <w:rPr>
+                <w:rFonts w:ascii="Calibri" w:eastAsia="Times New Roman" w:hAnsi="Calibri" w:cs="Calibri"/>
+                <w:color w:val="005975"/>
+                <w:kern w:val="0"/>
+                <w:sz w:val="24"/>
+                <w:szCs w:val="24"/>
+                <w:lang w:eastAsia="en-IN" w:bidi="hi-IN"/>
+                <w14:ligatures w14:val="none"/>
+              </w:rPr>
+              <w:t>Sodam</w:t>
+            </w:r>
+            <w:proofErr w:type="spellEnd"/>
+            <w:r>
+              <w:rPr>
+                <w:rFonts w:ascii="Calibri" w:eastAsia="Times New Roman" w:hAnsi="Calibri" w:cs="Calibri"/>
+                <w:color w:val="005975"/>
+                <w:kern w:val="0"/>
+                <w:sz w:val="24"/>
+                <w:szCs w:val="24"/>
+                <w:lang w:eastAsia="en-IN" w:bidi="hi-IN"/>
+                <w14:ligatures w14:val="none"/>
+              </w:rPr>
+              <w:t xml:space="preserve"> Korean Restaurant</w:t>
             </w:r>
           </w:p>
         </w:tc>
@@ -9398,17 +9554,31 @@
                 <w14:ligatures w14:val="none"/>
               </w:rPr>
             </w:pPr>
-            <w:r>
-              <w:rPr>
-                <w:rFonts w:ascii="Calibri" w:eastAsia="Times New Roman" w:hAnsi="Calibri" w:cs="Calibri"/>
-                <w:color w:val="005975"/>
-                <w:kern w:val="0"/>
-                <w:sz w:val="24"/>
-                <w:szCs w:val="24"/>
-                <w:lang w:eastAsia="en-IN" w:bidi="hi-IN"/>
-                <w14:ligatures w14:val="none"/>
-              </w:rPr>
-              <w:t>Silantro Fil-Mex</w:t>
+            <w:proofErr w:type="spellStart"/>
+            <w:r>
+              <w:rPr>
+                <w:rFonts w:ascii="Calibri" w:eastAsia="Times New Roman" w:hAnsi="Calibri" w:cs="Calibri"/>
+                <w:color w:val="005975"/>
+                <w:kern w:val="0"/>
+                <w:sz w:val="24"/>
+                <w:szCs w:val="24"/>
+                <w:lang w:eastAsia="en-IN" w:bidi="hi-IN"/>
+                <w14:ligatures w14:val="none"/>
+              </w:rPr>
+              <w:t>Silantro</w:t>
+            </w:r>
+            <w:proofErr w:type="spellEnd"/>
+            <w:r>
+              <w:rPr>
+                <w:rFonts w:ascii="Calibri" w:eastAsia="Times New Roman" w:hAnsi="Calibri" w:cs="Calibri"/>
+                <w:color w:val="005975"/>
+                <w:kern w:val="0"/>
+                <w:sz w:val="24"/>
+                <w:szCs w:val="24"/>
+                <w:lang w:eastAsia="en-IN" w:bidi="hi-IN"/>
+                <w14:ligatures w14:val="none"/>
+              </w:rPr>
+              <w:t xml:space="preserve"> Fil-Mex</w:t>
             </w:r>
           </w:p>
         </w:tc>
@@ -9662,8 +9832,22 @@
                 <w:lang w:eastAsia="en-IN" w:bidi="hi-IN"/>
                 <w14:ligatures w14:val="none"/>
               </w:rPr>
-              <w:t>Cafe Arabelle</w:t>
-            </w:r>
+              <w:t xml:space="preserve">Cafe </w:t>
+            </w:r>
+            <w:proofErr w:type="spellStart"/>
+            <w:r>
+              <w:rPr>
+                <w:rFonts w:ascii="Calibri" w:eastAsia="Times New Roman" w:hAnsi="Calibri" w:cs="Calibri"/>
+                <w:color w:val="005975"/>
+                <w:kern w:val="0"/>
+                <w:sz w:val="24"/>
+                <w:szCs w:val="24"/>
+                <w:lang w:eastAsia="en-IN" w:bidi="hi-IN"/>
+                <w14:ligatures w14:val="none"/>
+              </w:rPr>
+              <w:t>Arabelle</w:t>
+            </w:r>
+            <w:proofErr w:type="spellEnd"/>
           </w:p>
         </w:tc>
         <w:tc>
@@ -9906,17 +10090,31 @@
                 <w14:ligatures w14:val="none"/>
               </w:rPr>
             </w:pPr>
-            <w:r>
-              <w:rPr>
-                <w:rFonts w:ascii="Calibri" w:eastAsia="Times New Roman" w:hAnsi="Calibri" w:cs="Calibri"/>
-                <w:color w:val="005975"/>
-                <w:kern w:val="0"/>
-                <w:sz w:val="24"/>
-                <w:szCs w:val="24"/>
-                <w:lang w:eastAsia="en-IN" w:bidi="hi-IN"/>
-                <w14:ligatures w14:val="none"/>
-              </w:rPr>
-              <w:t>Silantro Fil-Mex</w:t>
+            <w:proofErr w:type="spellStart"/>
+            <w:r>
+              <w:rPr>
+                <w:rFonts w:ascii="Calibri" w:eastAsia="Times New Roman" w:hAnsi="Calibri" w:cs="Calibri"/>
+                <w:color w:val="005975"/>
+                <w:kern w:val="0"/>
+                <w:sz w:val="24"/>
+                <w:szCs w:val="24"/>
+                <w:lang w:eastAsia="en-IN" w:bidi="hi-IN"/>
+                <w14:ligatures w14:val="none"/>
+              </w:rPr>
+              <w:t>Silantro</w:t>
+            </w:r>
+            <w:proofErr w:type="spellEnd"/>
+            <w:r>
+              <w:rPr>
+                <w:rFonts w:ascii="Calibri" w:eastAsia="Times New Roman" w:hAnsi="Calibri" w:cs="Calibri"/>
+                <w:color w:val="005975"/>
+                <w:kern w:val="0"/>
+                <w:sz w:val="24"/>
+                <w:szCs w:val="24"/>
+                <w:lang w:eastAsia="en-IN" w:bidi="hi-IN"/>
+                <w14:ligatures w14:val="none"/>
+              </w:rPr>
+              <w:t xml:space="preserve"> Fil-Mex</w:t>
             </w:r>
           </w:p>
         </w:tc>
@@ -10243,6 +10441,7 @@
                 <w14:ligatures w14:val="none"/>
               </w:rPr>
             </w:pPr>
+            <w:proofErr w:type="spellStart"/>
             <w:r>
               <w:rPr>
                 <w:rFonts w:ascii="Calibri" w:eastAsia="Times New Roman" w:hAnsi="Calibri" w:cs="Calibri"/>
@@ -10257,6 +10456,7 @@
               </w:rPr>
               <w:t>RestaurantName</w:t>
             </w:r>
+            <w:proofErr w:type="spellEnd"/>
           </w:p>
         </w:tc>
         <w:tc>
@@ -10333,6 +10533,7 @@
                 <w14:ligatures w14:val="none"/>
               </w:rPr>
             </w:pPr>
+            <w:proofErr w:type="spellStart"/>
             <w:r>
               <w:rPr>
                 <w:rFonts w:ascii="Calibri" w:eastAsia="Times New Roman" w:hAnsi="Calibri" w:cs="Calibri"/>
@@ -10347,6 +10548,7 @@
               </w:rPr>
               <w:t>Price_range</w:t>
             </w:r>
+            <w:proofErr w:type="spellEnd"/>
           </w:p>
         </w:tc>
         <w:tc>
@@ -10378,6 +10580,7 @@
                 <w14:ligatures w14:val="none"/>
               </w:rPr>
             </w:pPr>
+            <w:proofErr w:type="spellStart"/>
             <w:r>
               <w:rPr>
                 <w:rFonts w:ascii="Calibri" w:eastAsia="Times New Roman" w:hAnsi="Calibri" w:cs="Calibri"/>
@@ -10392,6 +10595,7 @@
               </w:rPr>
               <w:t>Average_Cost_for_two</w:t>
             </w:r>
+            <w:proofErr w:type="spellEnd"/>
           </w:p>
         </w:tc>
         <w:tc>
@@ -12294,17 +12498,31 @@
                 <w14:ligatures w14:val="none"/>
               </w:rPr>
             </w:pPr>
-            <w:r>
-              <w:rPr>
-                <w:rFonts w:ascii="Calibri" w:eastAsia="Times New Roman" w:hAnsi="Calibri" w:cs="Calibri"/>
-                <w:color w:val="005975"/>
-                <w:kern w:val="0"/>
-                <w:sz w:val="24"/>
-                <w:szCs w:val="24"/>
-                <w:lang w:eastAsia="en-IN" w:bidi="hi-IN"/>
-                <w14:ligatures w14:val="none"/>
-              </w:rPr>
-              <w:t>Funkey Monkey</w:t>
+            <w:proofErr w:type="spellStart"/>
+            <w:r>
+              <w:rPr>
+                <w:rFonts w:ascii="Calibri" w:eastAsia="Times New Roman" w:hAnsi="Calibri" w:cs="Calibri"/>
+                <w:color w:val="005975"/>
+                <w:kern w:val="0"/>
+                <w:sz w:val="24"/>
+                <w:szCs w:val="24"/>
+                <w:lang w:eastAsia="en-IN" w:bidi="hi-IN"/>
+                <w14:ligatures w14:val="none"/>
+              </w:rPr>
+              <w:t>Funkey</w:t>
+            </w:r>
+            <w:proofErr w:type="spellEnd"/>
+            <w:r>
+              <w:rPr>
+                <w:rFonts w:ascii="Calibri" w:eastAsia="Times New Roman" w:hAnsi="Calibri" w:cs="Calibri"/>
+                <w:color w:val="005975"/>
+                <w:kern w:val="0"/>
+                <w:sz w:val="24"/>
+                <w:szCs w:val="24"/>
+                <w:lang w:eastAsia="en-IN" w:bidi="hi-IN"/>
+                <w14:ligatures w14:val="none"/>
+              </w:rPr>
+              <w:t xml:space="preserve"> Monkey</w:t>
             </w:r>
           </w:p>
         </w:tc>
@@ -12590,6 +12808,7 @@
                 <w14:ligatures w14:val="none"/>
               </w:rPr>
             </w:pPr>
+            <w:proofErr w:type="spellStart"/>
             <w:r>
               <w:rPr>
                 <w:rFonts w:ascii="Calibri" w:eastAsia="Times New Roman" w:hAnsi="Calibri" w:cs="Calibri"/>
@@ -12604,6 +12823,7 @@
               </w:rPr>
               <w:t>RestaurantName</w:t>
             </w:r>
+            <w:proofErr w:type="spellEnd"/>
           </w:p>
         </w:tc>
         <w:tc>
@@ -12680,6 +12900,7 @@
                 <w14:ligatures w14:val="none"/>
               </w:rPr>
             </w:pPr>
+            <w:proofErr w:type="spellStart"/>
             <w:r>
               <w:rPr>
                 <w:rFonts w:ascii="Calibri" w:eastAsia="Times New Roman" w:hAnsi="Calibri" w:cs="Calibri"/>
@@ -12694,6 +12915,7 @@
               </w:rPr>
               <w:t>Price_range</w:t>
             </w:r>
+            <w:proofErr w:type="spellEnd"/>
           </w:p>
         </w:tc>
         <w:tc>
@@ -12725,6 +12947,7 @@
                 <w14:ligatures w14:val="none"/>
               </w:rPr>
             </w:pPr>
+            <w:proofErr w:type="spellStart"/>
             <w:r>
               <w:rPr>
                 <w:rFonts w:ascii="Calibri" w:eastAsia="Times New Roman" w:hAnsi="Calibri" w:cs="Calibri"/>
@@ -12739,6 +12962,7 @@
               </w:rPr>
               <w:t>Average_Cost_for_two</w:t>
             </w:r>
+            <w:proofErr w:type="spellEnd"/>
           </w:p>
         </w:tc>
         <w:tc>
@@ -16297,15 +16521,27 @@
                 <w14:ligatures w14:val="none"/>
               </w:rPr>
             </w:pPr>
-            <w:r>
-              <w:rPr>
-                <w:rFonts w:ascii="Verdana" w:eastAsia="Times New Roman" w:hAnsi="Verdana" w:cs="Times New Roman"/>
-                <w:color w:val="005975"/>
-                <w:kern w:val="0"/>
-                <w:lang w:eastAsia="en-IN" w:bidi="hi-IN"/>
-                <w14:ligatures w14:val="none"/>
-              </w:rPr>
-              <w:t>Sunda, Indonesian</w:t>
+            <w:proofErr w:type="spellStart"/>
+            <w:r>
+              <w:rPr>
+                <w:rFonts w:ascii="Verdana" w:eastAsia="Times New Roman" w:hAnsi="Verdana" w:cs="Times New Roman"/>
+                <w:color w:val="005975"/>
+                <w:kern w:val="0"/>
+                <w:lang w:eastAsia="en-IN" w:bidi="hi-IN"/>
+                <w14:ligatures w14:val="none"/>
+              </w:rPr>
+              <w:t>Sunda</w:t>
+            </w:r>
+            <w:proofErr w:type="spellEnd"/>
+            <w:r>
+              <w:rPr>
+                <w:rFonts w:ascii="Verdana" w:eastAsia="Times New Roman" w:hAnsi="Verdana" w:cs="Times New Roman"/>
+                <w:color w:val="005975"/>
+                <w:kern w:val="0"/>
+                <w:lang w:eastAsia="en-IN" w:bidi="hi-IN"/>
+                <w14:ligatures w14:val="none"/>
+              </w:rPr>
+              <w:t>, Indonesian</w:t>
             </w:r>
           </w:p>
         </w:tc>
@@ -23357,6 +23593,85 @@
     <w:p>
       <w:pPr>
         <w:rPr>
+          <w:b/>
+          <w:bCs/>
+          <w:sz w:val="24"/>
+          <w:szCs w:val="24"/>
+        </w:rPr>
+      </w:pPr>
+      <w:r>
+        <w:rPr>
+          <w:b/>
+          <w:bCs/>
+          <w:sz w:val="24"/>
+          <w:szCs w:val="24"/>
+        </w:rPr>
+        <w:t>Cuisines Price can be higher for the restaurant in Canada as the cost is highly correlated with rating. But for other countries, there is no correlation/very less correlation. So keeping prices higher is not a good idea.</w:t>
+      </w:r>
+    </w:p>
+    <w:p>
+      <w:pPr>
+        <w:pStyle w:val="NormalWeb"/>
+        <w:spacing w:before="0" w:beforeAutospacing="0" w:after="0" w:afterAutospacing="0"/>
+        <w:textAlignment w:val="baseline"/>
+        <w:rPr>
+          <w:rFonts w:ascii="Arial" w:hAnsi="Arial" w:cs="Arial"/>
+          <w:color w:val="000000"/>
+        </w:rPr>
+      </w:pPr>
+    </w:p>
+    <w:p>
+      <w:pPr>
+        <w:pStyle w:val="NormalWeb"/>
+        <w:spacing w:before="0" w:beforeAutospacing="0" w:after="0" w:afterAutospacing="0"/>
+        <w:textAlignment w:val="baseline"/>
+        <w:rPr>
+          <w:rFonts w:ascii="Arial" w:hAnsi="Arial" w:cs="Arial"/>
+          <w:color w:val="000000"/>
+        </w:rPr>
+      </w:pPr>
+    </w:p>
+    <w:p>
+      <w:pPr>
+        <w:pStyle w:val="NormalWeb"/>
+        <w:numPr>
+          <w:ilvl w:val="0"/>
+          <w:numId w:val="3"/>
+        </w:numPr>
+        <w:spacing w:before="0" w:beforeAutospacing="0" w:after="0" w:afterAutospacing="0"/>
+        <w:textAlignment w:val="baseline"/>
+        <w:rPr>
+          <w:rFonts w:ascii="Arial" w:hAnsi="Arial" w:cs="Arial"/>
+          <w:b/>
+          <w:bCs/>
+          <w:color w:val="000000"/>
+        </w:rPr>
+      </w:pPr>
+      <w:r>
+        <w:rPr>
+          <w:rFonts w:ascii="Arial" w:hAnsi="Arial" w:cs="Arial"/>
+          <w:color w:val="000000"/>
+        </w:rPr>
+        <w:t>What is the distribution of a number of restaurants of different price ranges in all the countries?</w:t>
+      </w:r>
+    </w:p>
+    <w:p>
+      <w:pPr>
+        <w:ind w:left="720"/>
+        <w:rPr>
+          <w:rFonts w:ascii="Times New Roman" w:hAnsi="Times New Roman" w:cs="Times New Roman"/>
+          <w:b/>
+          <w:bCs/>
+          <w:sz w:val="52"/>
+          <w:szCs w:val="52"/>
+          <w:u w:val="single"/>
+        </w:rPr>
+      </w:pPr>
+    </w:p>
+    <w:p>
+      <w:pPr>
+        <w:ind w:left="720"/>
+        <w:rPr>
           <w:rFonts w:ascii="Times New Roman" w:hAnsi="Times New Roman" w:cs="Times New Roman"/>
           <w:b/>
           <w:bCs/>
@@ -23367,12 +23682,27 @@
       </w:pPr>
       <w:r>
         <w:rPr>
-          <w:b/>
-          <w:bCs/>
-          <w:sz w:val="24"/>
-          <w:szCs w:val="24"/>
+          <w:noProof/>
         </w:rPr>
-        <w:t>Cuisines Price can be higher for the restaurant in Canada as the cost is highly correlated with rating. But for other countries, there is no correlation/very less correlation. So keeping prices higher is not a good idea.</w:t>
+        <w:drawing>
+          <wp:inline distT="0" distB="0" distL="0" distR="0" wp14:anchorId="10E19AFD" wp14:editId="2FC1427B">
+            <wp:extent cx="5539154" cy="2111717"/>
+            <wp:effectExtent l="0" t="0" r="10795" b="9525"/>
+            <wp:docPr id="1204654740" name="Chart 1">
+              <a:extLst xmlns:a="http://schemas.openxmlformats.org/drawingml/2006/main">
+                <a:ext uri="{FF2B5EF4-FFF2-40B4-BE49-F238E27FC236}">
+                  <a16:creationId xmlns:a16="http://schemas.microsoft.com/office/drawing/2014/main" id="{E0D3AD6C-94C0-A6BC-0501-E6B155E214AA}"/>
+                </a:ext>
+              </a:extLst>
+            </wp:docPr>
+            <wp:cNvGraphicFramePr/>
+            <a:graphic xmlns:a="http://schemas.openxmlformats.org/drawingml/2006/main">
+              <a:graphicData uri="http://schemas.openxmlformats.org/drawingml/2006/chart">
+                <c:chart xmlns:c="http://schemas.openxmlformats.org/drawingml/2006/chart" xmlns:r="http://schemas.openxmlformats.org/officeDocument/2006/relationships" r:id="rId11"/>
+              </a:graphicData>
+            </a:graphic>
+          </wp:inline>
+        </w:drawing>
       </w:r>
     </w:p>
     <w:sectPr>
@@ -23844,6 +24174,119 @@
     </w:lvl>
   </w:abstractNum>
   <w:abstractNum w:abstractNumId="4" w15:restartNumberingAfterBreak="0">
+    <w:nsid w:val="2B4120BE"/>
+    <w:multiLevelType w:val="multilevel"/>
+    <w:tmpl w:val="BA62F03A"/>
+    <w:lvl w:ilvl="0">
+      <w:start w:val="1"/>
+      <w:numFmt w:val="decimal"/>
+      <w:lvlText w:val="%1."/>
+      <w:lvlJc w:val="left"/>
+      <w:pPr>
+        <w:tabs>
+          <w:tab w:val="num" w:pos="720"/>
+        </w:tabs>
+        <w:ind w:left="720" w:hanging="360"/>
+      </w:pPr>
+    </w:lvl>
+    <w:lvl w:ilvl="1" w:tentative="1">
+      <w:start w:val="1"/>
+      <w:numFmt w:val="decimal"/>
+      <w:lvlText w:val="%2."/>
+      <w:lvlJc w:val="left"/>
+      <w:pPr>
+        <w:tabs>
+          <w:tab w:val="num" w:pos="1440"/>
+        </w:tabs>
+        <w:ind w:left="1440" w:hanging="360"/>
+      </w:pPr>
+    </w:lvl>
+    <w:lvl w:ilvl="2" w:tentative="1">
+      <w:start w:val="1"/>
+      <w:numFmt w:val="decimal"/>
+      <w:lvlText w:val="%3."/>
+      <w:lvlJc w:val="left"/>
+      <w:pPr>
+        <w:tabs>
+          <w:tab w:val="num" w:pos="2160"/>
+        </w:tabs>
+        <w:ind w:left="2160" w:hanging="360"/>
+      </w:pPr>
+    </w:lvl>
+    <w:lvl w:ilvl="3" w:tentative="1">
+      <w:start w:val="1"/>
+      <w:numFmt w:val="decimal"/>
+      <w:lvlText w:val="%4."/>
+      <w:lvlJc w:val="left"/>
+      <w:pPr>
+        <w:tabs>
+          <w:tab w:val="num" w:pos="2880"/>
+        </w:tabs>
+        <w:ind w:left="2880" w:hanging="360"/>
+      </w:pPr>
+    </w:lvl>
+    <w:lvl w:ilvl="4" w:tentative="1">
+      <w:start w:val="1"/>
+      <w:numFmt w:val="decimal"/>
+      <w:lvlText w:val="%5."/>
+      <w:lvlJc w:val="left"/>
+      <w:pPr>
+        <w:tabs>
+          <w:tab w:val="num" w:pos="3600"/>
+        </w:tabs>
+        <w:ind w:left="3600" w:hanging="360"/>
+      </w:pPr>
+    </w:lvl>
+    <w:lvl w:ilvl="5" w:tentative="1">
+      <w:start w:val="1"/>
+      <w:numFmt w:val="decimal"/>
+      <w:lvlText w:val="%6."/>
+      <w:lvlJc w:val="left"/>
+      <w:pPr>
+        <w:tabs>
+          <w:tab w:val="num" w:pos="4320"/>
+        </w:tabs>
+        <w:ind w:left="4320" w:hanging="360"/>
+      </w:pPr>
+    </w:lvl>
+    <w:lvl w:ilvl="6" w:tentative="1">
+      <w:start w:val="1"/>
+      <w:numFmt w:val="decimal"/>
+      <w:lvlText w:val="%7."/>
+      <w:lvlJc w:val="left"/>
+      <w:pPr>
+        <w:tabs>
+          <w:tab w:val="num" w:pos="5040"/>
+        </w:tabs>
+        <w:ind w:left="5040" w:hanging="360"/>
+      </w:pPr>
+    </w:lvl>
+    <w:lvl w:ilvl="7" w:tentative="1">
+      <w:start w:val="1"/>
+      <w:numFmt w:val="decimal"/>
+      <w:lvlText w:val="%8."/>
+      <w:lvlJc w:val="left"/>
+      <w:pPr>
+        <w:tabs>
+          <w:tab w:val="num" w:pos="5760"/>
+        </w:tabs>
+        <w:ind w:left="5760" w:hanging="360"/>
+      </w:pPr>
+    </w:lvl>
+    <w:lvl w:ilvl="8" w:tentative="1">
+      <w:start w:val="1"/>
+      <w:numFmt w:val="decimal"/>
+      <w:lvlText w:val="%9."/>
+      <w:lvlJc w:val="left"/>
+      <w:pPr>
+        <w:tabs>
+          <w:tab w:val="num" w:pos="6480"/>
+        </w:tabs>
+        <w:ind w:left="6480" w:hanging="360"/>
+      </w:pPr>
+    </w:lvl>
+  </w:abstractNum>
+  <w:abstractNum w:abstractNumId="5" w15:restartNumberingAfterBreak="0">
     <w:nsid w:val="5E745961"/>
     <w:multiLevelType w:val="hybridMultilevel"/>
     <w:tmpl w:val="5F9E8EFE"/>
@@ -23956,7 +24399,7 @@
       </w:rPr>
     </w:lvl>
   </w:abstractNum>
-  <w:abstractNum w:abstractNumId="5" w15:restartNumberingAfterBreak="0">
+  <w:abstractNum w:abstractNumId="6" w15:restartNumberingAfterBreak="0">
     <w:nsid w:val="68F26756"/>
     <w:multiLevelType w:val="hybridMultilevel"/>
     <w:tmpl w:val="2C10C1F6"/>
@@ -24073,7 +24516,7 @@
     <w:abstractNumId w:val="3"/>
   </w:num>
   <w:num w:numId="2" w16cid:durableId="1534418141">
-    <w:abstractNumId w:val="4"/>
+    <w:abstractNumId w:val="5"/>
   </w:num>
   <w:num w:numId="3" w16cid:durableId="657807447">
     <w:abstractNumId w:val="2"/>
@@ -24085,7 +24528,10 @@
     <w:abstractNumId w:val="0"/>
   </w:num>
   <w:num w:numId="6" w16cid:durableId="2145926750">
-    <w:abstractNumId w:val="5"/>
+    <w:abstractNumId w:val="6"/>
+  </w:num>
+  <w:num w:numId="7" w16cid:durableId="1207836709">
+    <w:abstractNumId w:val="4"/>
   </w:num>
 </w:numbering>
 </file>
@@ -24529,13 +24975,32 @@
       <w:contextualSpacing/>
     </w:pPr>
   </w:style>
+  <w:style w:type="paragraph" w:styleId="NormalWeb">
+    <w:name w:val="Normal (Web)"/>
+    <w:basedOn w:val="Normal"/>
+    <w:uiPriority w:val="99"/>
+    <w:semiHidden/>
+    <w:unhideWhenUsed/>
+    <w:rsid w:val="00724319"/>
+    <w:pPr>
+      <w:spacing w:before="100" w:beforeAutospacing="1" w:after="100" w:afterAutospacing="1" w:line="240" w:lineRule="auto"/>
+    </w:pPr>
+    <w:rPr>
+      <w:rFonts w:ascii="Times New Roman" w:eastAsia="Times New Roman" w:hAnsi="Times New Roman" w:cs="Times New Roman"/>
+      <w:kern w:val="0"/>
+      <w:sz w:val="24"/>
+      <w:szCs w:val="24"/>
+      <w:lang w:eastAsia="en-GB"/>
+      <w14:ligatures w14:val="none"/>
+    </w:rPr>
+  </w:style>
 </w:styles>
 </file>
 
 <file path=word/charts/chart1.xml><?xml version="1.0" encoding="utf-8"?>
 <c:chartSpace xmlns:c="http://schemas.openxmlformats.org/drawingml/2006/chart" xmlns:a="http://schemas.openxmlformats.org/drawingml/2006/main" xmlns:r="http://schemas.openxmlformats.org/officeDocument/2006/relationships" xmlns:c16r2="http://schemas.microsoft.com/office/drawing/2015/06/chart">
   <c:date1904 val="0"/>
-  <c:lang val="en-US"/>
+  <c:lang val="en-GB"/>
   <c:roundedCorners val="0"/>
   <mc:AlternateContent xmlns:mc="http://schemas.openxmlformats.org/markup-compatibility/2006">
     <mc:Choice xmlns:c14="http://schemas.microsoft.com/office/drawing/2007/8/2/chart" Requires="c14">
@@ -25181,7 +25646,7 @@
 <file path=word/charts/chart2.xml><?xml version="1.0" encoding="utf-8"?>
 <c:chartSpace xmlns:c="http://schemas.openxmlformats.org/drawingml/2006/chart" xmlns:a="http://schemas.openxmlformats.org/drawingml/2006/main" xmlns:r="http://schemas.openxmlformats.org/officeDocument/2006/relationships" xmlns:c16r2="http://schemas.microsoft.com/office/drawing/2015/06/chart">
   <c:date1904 val="0"/>
-  <c:lang val="en-US"/>
+  <c:lang val="en-GB"/>
   <c:roundedCorners val="0"/>
   <mc:AlternateContent xmlns:mc="http://schemas.openxmlformats.org/markup-compatibility/2006">
     <mc:Choice xmlns:c14="http://schemas.microsoft.com/office/drawing/2007/8/2/chart" Requires="c14">
@@ -25838,7 +26303,7 @@
 <file path=word/charts/chart3.xml><?xml version="1.0" encoding="utf-8"?>
 <c:chartSpace xmlns:c="http://schemas.openxmlformats.org/drawingml/2006/chart" xmlns:a="http://schemas.openxmlformats.org/drawingml/2006/main" xmlns:r="http://schemas.openxmlformats.org/officeDocument/2006/relationships" xmlns:c16r2="http://schemas.microsoft.com/office/drawing/2015/06/chart">
   <c:date1904 val="0"/>
-  <c:lang val="en-US"/>
+  <c:lang val="en-GB"/>
   <c:roundedCorners val="0"/>
   <mc:AlternateContent xmlns:mc="http://schemas.openxmlformats.org/markup-compatibility/2006">
     <mc:Choice xmlns:c14="http://schemas.microsoft.com/office/drawing/2007/8/2/chart" Requires="c14">
@@ -29619,7 +30084,7 @@
 <file path=word/charts/chart4.xml><?xml version="1.0" encoding="utf-8"?>
 <c:chartSpace xmlns:c="http://schemas.openxmlformats.org/drawingml/2006/chart" xmlns:a="http://schemas.openxmlformats.org/drawingml/2006/main" xmlns:r="http://schemas.openxmlformats.org/officeDocument/2006/relationships" xmlns:c16r2="http://schemas.microsoft.com/office/drawing/2015/06/chart">
   <c:date1904 val="0"/>
-  <c:lang val="en-US"/>
+  <c:lang val="en-GB"/>
   <c:roundedCorners val="0"/>
   <mc:AlternateContent xmlns:mc="http://schemas.openxmlformats.org/markup-compatibility/2006">
     <mc:Choice xmlns:c14="http://schemas.microsoft.com/office/drawing/2007/8/2/chart" Requires="c14">
@@ -30249,7 +30714,7 @@
 <file path=word/charts/chart5.xml><?xml version="1.0" encoding="utf-8"?>
 <c:chartSpace xmlns:c="http://schemas.openxmlformats.org/drawingml/2006/chart" xmlns:a="http://schemas.openxmlformats.org/drawingml/2006/main" xmlns:r="http://schemas.openxmlformats.org/officeDocument/2006/relationships" xmlns:c16r2="http://schemas.microsoft.com/office/drawing/2015/06/chart">
   <c:date1904 val="0"/>
-  <c:lang val="en-US"/>
+  <c:lang val="en-GB"/>
   <c:roundedCorners val="0"/>
   <mc:AlternateContent xmlns:mc="http://schemas.openxmlformats.org/markup-compatibility/2006">
     <mc:Choice xmlns:c14="http://schemas.microsoft.com/office/drawing/2007/8/2/chart" Requires="c14">
@@ -31047,6 +31512,541 @@
 </c:chartSpace>
 </file>
 
+<file path=word/charts/chart6.xml><?xml version="1.0" encoding="utf-8"?>
+<c:chartSpace xmlns:c="http://schemas.openxmlformats.org/drawingml/2006/chart" xmlns:a="http://schemas.openxmlformats.org/drawingml/2006/main" xmlns:r="http://schemas.openxmlformats.org/officeDocument/2006/relationships" xmlns:c16r2="http://schemas.microsoft.com/office/drawing/2015/06/chart">
+  <c:date1904 val="0"/>
+  <c:lang val="en-GB"/>
+  <c:roundedCorners val="0"/>
+  <mc:AlternateContent xmlns:mc="http://schemas.openxmlformats.org/markup-compatibility/2006">
+    <mc:Choice xmlns:c14="http://schemas.microsoft.com/office/drawing/2007/8/2/chart" Requires="c14">
+      <c14:style val="102"/>
+    </mc:Choice>
+    <mc:Fallback>
+      <c:style val="2"/>
+    </mc:Fallback>
+  </mc:AlternateContent>
+  <c:pivotSource>
+    <c:name>[Zomato Restaurant Analysis.xlsx]Price Range of Different Restau!Price Range of Different Restau</c:name>
+    <c:fmtId val="-1"/>
+  </c:pivotSource>
+  <c:chart>
+    <c:title>
+      <c:tx>
+        <c:rich>
+          <a:bodyPr rot="0" spcFirstLastPara="1" vertOverflow="ellipsis" vert="horz" wrap="square" anchor="ctr" anchorCtr="1"/>
+          <a:lstStyle/>
+          <a:p>
+            <a:pPr algn="ctr">
+              <a:defRPr sz="800" b="1" i="0" u="none" strike="noStrike" kern="1200" spc="0" baseline="0">
+                <a:solidFill>
+                  <a:schemeClr val="bg1"/>
+                </a:solidFill>
+                <a:latin typeface="+mn-lt"/>
+                <a:ea typeface="+mn-ea"/>
+                <a:cs typeface="+mn-cs"/>
+              </a:defRPr>
+            </a:pPr>
+            <a:r>
+              <a:rPr lang="en-IN" sz="800" b="1">
+                <a:solidFill>
+                  <a:schemeClr val="bg1"/>
+                </a:solidFill>
+              </a:rPr>
+              <a:t>RESTAURANTS IN</a:t>
+            </a:r>
+            <a:r>
+              <a:rPr lang="en-IN" sz="800" b="1" baseline="0">
+                <a:solidFill>
+                  <a:schemeClr val="bg1"/>
+                </a:solidFill>
+              </a:rPr>
+              <a:t> DIFFERENT PRICE RANGE</a:t>
+            </a:r>
+            <a:endParaRPr lang="en-IN" sz="800" b="1">
+              <a:solidFill>
+                <a:schemeClr val="bg1"/>
+              </a:solidFill>
+            </a:endParaRPr>
+          </a:p>
+        </c:rich>
+      </c:tx>
+      <c:layout>
+        <c:manualLayout>
+          <c:xMode val="edge"/>
+          <c:yMode val="edge"/>
+          <c:x val="0.34203901171759693"/>
+          <c:y val="5.5721034870641173E-2"/>
+        </c:manualLayout>
+      </c:layout>
+      <c:overlay val="0"/>
+      <c:spPr>
+        <a:solidFill>
+          <a:schemeClr val="tx1"/>
+        </a:solidFill>
+        <a:ln>
+          <a:noFill/>
+        </a:ln>
+        <a:effectLst/>
+      </c:spPr>
+      <c:txPr>
+        <a:bodyPr rot="0" spcFirstLastPara="1" vertOverflow="ellipsis" vert="horz" wrap="square" anchor="ctr" anchorCtr="1"/>
+        <a:lstStyle/>
+        <a:p>
+          <a:pPr algn="ctr">
+            <a:defRPr sz="800" b="1" i="0" u="none" strike="noStrike" kern="1200" spc="0" baseline="0">
+              <a:solidFill>
+                <a:schemeClr val="bg1"/>
+              </a:solidFill>
+              <a:latin typeface="+mn-lt"/>
+              <a:ea typeface="+mn-ea"/>
+              <a:cs typeface="+mn-cs"/>
+            </a:defRPr>
+          </a:pPr>
+          <a:endParaRPr lang="en-US"/>
+        </a:p>
+      </c:txPr>
+    </c:title>
+    <c:autoTitleDeleted val="0"/>
+    <c:pivotFmts>
+      <c:pivotFmt>
+        <c:idx val="0"/>
+        <c:spPr>
+          <a:solidFill>
+            <a:schemeClr val="accent1"/>
+          </a:solidFill>
+          <a:ln>
+            <a:noFill/>
+          </a:ln>
+          <a:effectLst/>
+        </c:spPr>
+        <c:marker>
+          <c:symbol val="none"/>
+        </c:marker>
+        <c:dLbl>
+          <c:idx val="0"/>
+          <c:spPr>
+            <a:solidFill>
+              <a:schemeClr val="tx1"/>
+            </a:solidFill>
+            <a:ln>
+              <a:noFill/>
+            </a:ln>
+            <a:effectLst/>
+          </c:spPr>
+          <c:txPr>
+            <a:bodyPr rot="0" spcFirstLastPara="1" vertOverflow="ellipsis" vert="horz" wrap="square" lIns="38100" tIns="19050" rIns="38100" bIns="19050" anchor="ctr" anchorCtr="1">
+              <a:spAutoFit/>
+            </a:bodyPr>
+            <a:lstStyle/>
+            <a:p>
+              <a:pPr>
+                <a:defRPr sz="900" b="1" i="0" u="none" strike="noStrike" kern="1200" baseline="0">
+                  <a:solidFill>
+                    <a:schemeClr val="bg1"/>
+                  </a:solidFill>
+                  <a:latin typeface="+mn-lt"/>
+                  <a:ea typeface="+mn-ea"/>
+                  <a:cs typeface="+mn-cs"/>
+                </a:defRPr>
+              </a:pPr>
+              <a:endParaRPr lang="en-US"/>
+            </a:p>
+          </c:txPr>
+          <c:dLblPos val="inEnd"/>
+          <c:showLegendKey val="0"/>
+          <c:showVal val="1"/>
+          <c:showCatName val="0"/>
+          <c:showSerName val="0"/>
+          <c:showPercent val="0"/>
+          <c:showBubbleSize val="0"/>
+          <c:extLst>
+            <c:ext xmlns:c15="http://schemas.microsoft.com/office/drawing/2012/chart" uri="{CE6537A1-D6FC-4f65-9D91-7224C49458BB}"/>
+          </c:extLst>
+        </c:dLbl>
+      </c:pivotFmt>
+      <c:pivotFmt>
+        <c:idx val="1"/>
+        <c:spPr>
+          <a:solidFill>
+            <a:schemeClr val="accent1"/>
+          </a:solidFill>
+          <a:ln>
+            <a:noFill/>
+          </a:ln>
+          <a:effectLst/>
+        </c:spPr>
+        <c:marker>
+          <c:symbol val="none"/>
+        </c:marker>
+        <c:dLbl>
+          <c:idx val="0"/>
+          <c:spPr>
+            <a:solidFill>
+              <a:schemeClr val="tx1"/>
+            </a:solidFill>
+            <a:ln>
+              <a:noFill/>
+            </a:ln>
+            <a:effectLst/>
+          </c:spPr>
+          <c:txPr>
+            <a:bodyPr rot="0" spcFirstLastPara="1" vertOverflow="ellipsis" vert="horz" wrap="square" lIns="38100" tIns="19050" rIns="38100" bIns="19050" anchor="ctr" anchorCtr="1">
+              <a:spAutoFit/>
+            </a:bodyPr>
+            <a:lstStyle/>
+            <a:p>
+              <a:pPr>
+                <a:defRPr sz="900" b="1" i="0" u="none" strike="noStrike" kern="1200" baseline="0">
+                  <a:solidFill>
+                    <a:schemeClr val="bg1"/>
+                  </a:solidFill>
+                  <a:latin typeface="+mn-lt"/>
+                  <a:ea typeface="+mn-ea"/>
+                  <a:cs typeface="+mn-cs"/>
+                </a:defRPr>
+              </a:pPr>
+              <a:endParaRPr lang="en-US"/>
+            </a:p>
+          </c:txPr>
+          <c:dLblPos val="inEnd"/>
+          <c:showLegendKey val="0"/>
+          <c:showVal val="1"/>
+          <c:showCatName val="0"/>
+          <c:showSerName val="0"/>
+          <c:showPercent val="0"/>
+          <c:showBubbleSize val="0"/>
+          <c:extLst>
+            <c:ext xmlns:c15="http://schemas.microsoft.com/office/drawing/2012/chart" uri="{CE6537A1-D6FC-4f65-9D91-7224C49458BB}"/>
+          </c:extLst>
+        </c:dLbl>
+      </c:pivotFmt>
+      <c:pivotFmt>
+        <c:idx val="2"/>
+        <c:spPr>
+          <a:solidFill>
+            <a:schemeClr val="accent1"/>
+          </a:solidFill>
+          <a:ln>
+            <a:noFill/>
+          </a:ln>
+          <a:effectLst/>
+        </c:spPr>
+        <c:marker>
+          <c:symbol val="none"/>
+        </c:marker>
+        <c:dLbl>
+          <c:idx val="0"/>
+          <c:spPr>
+            <a:solidFill>
+              <a:schemeClr val="tx1"/>
+            </a:solidFill>
+            <a:ln>
+              <a:noFill/>
+            </a:ln>
+            <a:effectLst/>
+          </c:spPr>
+          <c:txPr>
+            <a:bodyPr rot="0" spcFirstLastPara="1" vertOverflow="ellipsis" vert="horz" wrap="square" lIns="38100" tIns="19050" rIns="38100" bIns="19050" anchor="ctr" anchorCtr="1">
+              <a:spAutoFit/>
+            </a:bodyPr>
+            <a:lstStyle/>
+            <a:p>
+              <a:pPr>
+                <a:defRPr sz="900" b="1" i="0" u="none" strike="noStrike" kern="1200" baseline="0">
+                  <a:solidFill>
+                    <a:schemeClr val="bg1"/>
+                  </a:solidFill>
+                  <a:latin typeface="+mn-lt"/>
+                  <a:ea typeface="+mn-ea"/>
+                  <a:cs typeface="+mn-cs"/>
+                </a:defRPr>
+              </a:pPr>
+              <a:endParaRPr lang="en-US"/>
+            </a:p>
+          </c:txPr>
+          <c:dLblPos val="inEnd"/>
+          <c:showLegendKey val="0"/>
+          <c:showVal val="1"/>
+          <c:showCatName val="0"/>
+          <c:showSerName val="0"/>
+          <c:showPercent val="0"/>
+          <c:showBubbleSize val="0"/>
+          <c:extLst>
+            <c:ext xmlns:c15="http://schemas.microsoft.com/office/drawing/2012/chart" uri="{CE6537A1-D6FC-4f65-9D91-7224C49458BB}"/>
+          </c:extLst>
+        </c:dLbl>
+      </c:pivotFmt>
+    </c:pivotFmts>
+    <c:plotArea>
+      <c:layout/>
+      <c:barChart>
+        <c:barDir val="col"/>
+        <c:grouping val="clustered"/>
+        <c:varyColors val="0"/>
+        <c:ser>
+          <c:idx val="0"/>
+          <c:order val="0"/>
+          <c:tx>
+            <c:strRef>
+              <c:f>'Price Range of Different Restau'!$B$3</c:f>
+              <c:strCache>
+                <c:ptCount val="1"/>
+                <c:pt idx="0">
+                  <c:v>Total</c:v>
+                </c:pt>
+              </c:strCache>
+            </c:strRef>
+          </c:tx>
+          <c:spPr>
+            <a:solidFill>
+              <a:schemeClr val="accent1"/>
+            </a:solidFill>
+            <a:ln>
+              <a:noFill/>
+            </a:ln>
+            <a:effectLst/>
+          </c:spPr>
+          <c:invertIfNegative val="0"/>
+          <c:dLbls>
+            <c:spPr>
+              <a:solidFill>
+                <a:schemeClr val="tx1"/>
+              </a:solidFill>
+              <a:ln>
+                <a:noFill/>
+              </a:ln>
+              <a:effectLst/>
+            </c:spPr>
+            <c:txPr>
+              <a:bodyPr rot="0" spcFirstLastPara="1" vertOverflow="ellipsis" vert="horz" wrap="square" lIns="38100" tIns="19050" rIns="38100" bIns="19050" anchor="ctr" anchorCtr="1">
+                <a:spAutoFit/>
+              </a:bodyPr>
+              <a:lstStyle/>
+              <a:p>
+                <a:pPr>
+                  <a:defRPr sz="900" b="1" i="0" u="none" strike="noStrike" kern="1200" baseline="0">
+                    <a:solidFill>
+                      <a:schemeClr val="bg1"/>
+                    </a:solidFill>
+                    <a:latin typeface="+mn-lt"/>
+                    <a:ea typeface="+mn-ea"/>
+                    <a:cs typeface="+mn-cs"/>
+                  </a:defRPr>
+                </a:pPr>
+                <a:endParaRPr lang="en-US"/>
+              </a:p>
+            </c:txPr>
+            <c:dLblPos val="inEnd"/>
+            <c:showLegendKey val="0"/>
+            <c:showVal val="1"/>
+            <c:showCatName val="0"/>
+            <c:showSerName val="0"/>
+            <c:showPercent val="0"/>
+            <c:showBubbleSize val="0"/>
+            <c:showLeaderLines val="0"/>
+            <c:extLst>
+              <c:ext xmlns:c15="http://schemas.microsoft.com/office/drawing/2012/chart" uri="{CE6537A1-D6FC-4f65-9D91-7224C49458BB}">
+                <c15:showLeaderLines val="1"/>
+                <c15:leaderLines>
+                  <c:spPr>
+                    <a:ln w="9525" cap="flat" cmpd="sng" algn="ctr">
+                      <a:solidFill>
+                        <a:schemeClr val="tx1">
+                          <a:lumMod val="35000"/>
+                          <a:lumOff val="65000"/>
+                        </a:schemeClr>
+                      </a:solidFill>
+                      <a:round/>
+                    </a:ln>
+                    <a:effectLst/>
+                  </c:spPr>
+                </c15:leaderLines>
+              </c:ext>
+            </c:extLst>
+          </c:dLbls>
+          <c:cat>
+            <c:strRef>
+              <c:f>'Price Range of Different Restau'!$A$4:$A$8</c:f>
+              <c:strCache>
+                <c:ptCount val="4"/>
+                <c:pt idx="0">
+                  <c:v>1</c:v>
+                </c:pt>
+                <c:pt idx="1">
+                  <c:v>2</c:v>
+                </c:pt>
+                <c:pt idx="2">
+                  <c:v>3</c:v>
+                </c:pt>
+                <c:pt idx="3">
+                  <c:v>4</c:v>
+                </c:pt>
+              </c:strCache>
+            </c:strRef>
+          </c:cat>
+          <c:val>
+            <c:numRef>
+              <c:f>'Price Range of Different Restau'!$B$4:$B$8</c:f>
+              <c:numCache>
+                <c:formatCode>General</c:formatCode>
+                <c:ptCount val="4"/>
+                <c:pt idx="0">
+                  <c:v>4286</c:v>
+                </c:pt>
+                <c:pt idx="1">
+                  <c:v>2858</c:v>
+                </c:pt>
+                <c:pt idx="2">
+                  <c:v>1111</c:v>
+                </c:pt>
+                <c:pt idx="3">
+                  <c:v>388</c:v>
+                </c:pt>
+              </c:numCache>
+            </c:numRef>
+          </c:val>
+          <c:extLst>
+            <c:ext xmlns:c16="http://schemas.microsoft.com/office/drawing/2014/chart" uri="{C3380CC4-5D6E-409C-BE32-E72D297353CC}">
+              <c16:uniqueId val="{00000000-8515-7A47-8FAC-D28C086EF71C}"/>
+            </c:ext>
+          </c:extLst>
+        </c:ser>
+        <c:dLbls>
+          <c:showLegendKey val="0"/>
+          <c:showVal val="0"/>
+          <c:showCatName val="0"/>
+          <c:showSerName val="0"/>
+          <c:showPercent val="0"/>
+          <c:showBubbleSize val="0"/>
+        </c:dLbls>
+        <c:gapWidth val="19"/>
+        <c:overlap val="-27"/>
+        <c:axId val="862832031"/>
+        <c:axId val="838259119"/>
+      </c:barChart>
+      <c:catAx>
+        <c:axId val="862832031"/>
+        <c:scaling>
+          <c:orientation val="minMax"/>
+        </c:scaling>
+        <c:delete val="0"/>
+        <c:axPos val="b"/>
+        <c:numFmt formatCode="General" sourceLinked="1"/>
+        <c:majorTickMark val="none"/>
+        <c:minorTickMark val="none"/>
+        <c:tickLblPos val="nextTo"/>
+        <c:spPr>
+          <a:noFill/>
+          <a:ln w="9525" cap="flat" cmpd="sng" algn="ctr">
+            <a:solidFill>
+              <a:schemeClr val="tx1">
+                <a:lumMod val="15000"/>
+                <a:lumOff val="85000"/>
+              </a:schemeClr>
+            </a:solidFill>
+            <a:round/>
+          </a:ln>
+          <a:effectLst/>
+        </c:spPr>
+        <c:txPr>
+          <a:bodyPr rot="-60000000" spcFirstLastPara="1" vertOverflow="ellipsis" vert="horz" wrap="square" anchor="ctr" anchorCtr="1"/>
+          <a:lstStyle/>
+          <a:p>
+            <a:pPr>
+              <a:defRPr sz="900" b="1" i="0" u="none" strike="noStrike" kern="1200" baseline="0">
+                <a:solidFill>
+                  <a:schemeClr val="tx2"/>
+                </a:solidFill>
+                <a:latin typeface="+mn-lt"/>
+                <a:ea typeface="+mn-ea"/>
+                <a:cs typeface="+mn-cs"/>
+              </a:defRPr>
+            </a:pPr>
+            <a:endParaRPr lang="en-US"/>
+          </a:p>
+        </c:txPr>
+        <c:crossAx val="838259119"/>
+        <c:crosses val="autoZero"/>
+        <c:auto val="1"/>
+        <c:lblAlgn val="ctr"/>
+        <c:lblOffset val="100"/>
+        <c:noMultiLvlLbl val="0"/>
+      </c:catAx>
+      <c:valAx>
+        <c:axId val="838259119"/>
+        <c:scaling>
+          <c:orientation val="minMax"/>
+        </c:scaling>
+        <c:delete val="1"/>
+        <c:axPos val="l"/>
+        <c:numFmt formatCode="General" sourceLinked="1"/>
+        <c:majorTickMark val="none"/>
+        <c:minorTickMark val="none"/>
+        <c:tickLblPos val="nextTo"/>
+        <c:crossAx val="862832031"/>
+        <c:crosses val="autoZero"/>
+        <c:crossBetween val="between"/>
+      </c:valAx>
+      <c:spPr>
+        <a:noFill/>
+        <a:ln>
+          <a:noFill/>
+        </a:ln>
+        <a:effectLst/>
+      </c:spPr>
+    </c:plotArea>
+    <c:plotVisOnly val="1"/>
+    <c:dispBlanksAs val="gap"/>
+    <c:extLst>
+      <c:ext xmlns:c16r3="http://schemas.microsoft.com/office/drawing/2017/03/chart" uri="{56B9EC1D-385E-4148-901F-78D8002777C0}">
+        <c16r3:dataDisplayOptions16>
+          <c16r3:dispNaAsBlank val="1"/>
+        </c16r3:dataDisplayOptions16>
+      </c:ext>
+    </c:extLst>
+    <c:showDLblsOverMax val="0"/>
+  </c:chart>
+  <c:spPr>
+    <a:solidFill>
+      <a:schemeClr val="bg1"/>
+    </a:solidFill>
+    <a:ln w="9525" cap="flat" cmpd="sng" algn="ctr">
+      <a:solidFill>
+        <a:sysClr val="windowText" lastClr="000000"/>
+      </a:solidFill>
+      <a:round/>
+    </a:ln>
+    <a:effectLst/>
+  </c:spPr>
+  <c:txPr>
+    <a:bodyPr/>
+    <a:lstStyle/>
+    <a:p>
+      <a:pPr>
+        <a:defRPr/>
+      </a:pPr>
+      <a:endParaRPr lang="en-US"/>
+    </a:p>
+  </c:txPr>
+  <c:externalData r:id="rId3">
+    <c:autoUpdate val="0"/>
+  </c:externalData>
+  <c:extLst>
+    <c:ext xmlns:c14="http://schemas.microsoft.com/office/drawing/2007/8/2/chart" uri="{781A3756-C4B2-4CAC-9D66-4F8BD8637D16}">
+      <c14:pivotOptions>
+        <c14:dropZoneFilter val="1"/>
+        <c14:dropZonesVisible val="1"/>
+      </c14:pivotOptions>
+    </c:ext>
+    <c:ext xmlns:c16="http://schemas.microsoft.com/office/drawing/2014/chart" uri="{E28EC0CA-F0BB-4C9C-879D-F8772B89E7AC}">
+      <c16:pivotOptions16>
+        <c16:showExpandCollapseFieldButtons val="1"/>
+      </c16:pivotOptions16>
+    </c:ext>
+  </c:extLst>
+</c:chartSpace>
+</file>
+
 <file path=word/charts/colors1.xml><?xml version="1.0" encoding="utf-8"?>
 <cs:colorStyle xmlns:cs="http://schemas.microsoft.com/office/drawing/2012/chartStyle" xmlns:a="http://schemas.openxmlformats.org/drawingml/2006/main" meth="cycle" id="10">
   <a:schemeClr val="accent1"/>
@@ -31208,6 +32208,46 @@
 </file>
 
 <file path=word/charts/colors5.xml><?xml version="1.0" encoding="utf-8"?>
+<cs:colorStyle xmlns:cs="http://schemas.microsoft.com/office/drawing/2012/chartStyle" xmlns:a="http://schemas.openxmlformats.org/drawingml/2006/main" meth="cycle" id="10">
+  <a:schemeClr val="accent1"/>
+  <a:schemeClr val="accent2"/>
+  <a:schemeClr val="accent3"/>
+  <a:schemeClr val="accent4"/>
+  <a:schemeClr val="accent5"/>
+  <a:schemeClr val="accent6"/>
+  <cs:variation/>
+  <cs:variation>
+    <a:lumMod val="60000"/>
+  </cs:variation>
+  <cs:variation>
+    <a:lumMod val="80000"/>
+    <a:lumOff val="20000"/>
+  </cs:variation>
+  <cs:variation>
+    <a:lumMod val="80000"/>
+  </cs:variation>
+  <cs:variation>
+    <a:lumMod val="60000"/>
+    <a:lumOff val="40000"/>
+  </cs:variation>
+  <cs:variation>
+    <a:lumMod val="50000"/>
+  </cs:variation>
+  <cs:variation>
+    <a:lumMod val="70000"/>
+    <a:lumOff val="30000"/>
+  </cs:variation>
+  <cs:variation>
+    <a:lumMod val="70000"/>
+  </cs:variation>
+  <cs:variation>
+    <a:lumMod val="50000"/>
+    <a:lumOff val="50000"/>
+  </cs:variation>
+</cs:colorStyle>
+</file>
+
+<file path=word/charts/colors6.xml><?xml version="1.0" encoding="utf-8"?>
 <cs:colorStyle xmlns:cs="http://schemas.microsoft.com/office/drawing/2012/chartStyle" xmlns:a="http://schemas.openxmlformats.org/drawingml/2006/main" meth="cycle" id="10">
   <a:schemeClr val="accent1"/>
   <a:schemeClr val="accent2"/>
@@ -33764,6 +34804,509 @@
 </cs:chartStyle>
 </file>
 
+<file path=word/charts/style6.xml><?xml version="1.0" encoding="utf-8"?>
+<cs:chartStyle xmlns:cs="http://schemas.microsoft.com/office/drawing/2012/chartStyle" xmlns:a="http://schemas.openxmlformats.org/drawingml/2006/main" id="201">
+  <cs:axisTitle>
+    <cs:lnRef idx="0"/>
+    <cs:fillRef idx="0"/>
+    <cs:effectRef idx="0"/>
+    <cs:fontRef idx="minor">
+      <a:schemeClr val="tx1">
+        <a:lumMod val="65000"/>
+        <a:lumOff val="35000"/>
+      </a:schemeClr>
+    </cs:fontRef>
+    <cs:defRPr sz="1000" kern="1200"/>
+  </cs:axisTitle>
+  <cs:categoryAxis>
+    <cs:lnRef idx="0"/>
+    <cs:fillRef idx="0"/>
+    <cs:effectRef idx="0"/>
+    <cs:fontRef idx="minor">
+      <a:schemeClr val="tx1">
+        <a:lumMod val="65000"/>
+        <a:lumOff val="35000"/>
+      </a:schemeClr>
+    </cs:fontRef>
+    <cs:spPr>
+      <a:ln w="9525" cap="flat" cmpd="sng" algn="ctr">
+        <a:solidFill>
+          <a:schemeClr val="tx1">
+            <a:lumMod val="15000"/>
+            <a:lumOff val="85000"/>
+          </a:schemeClr>
+        </a:solidFill>
+        <a:round/>
+      </a:ln>
+    </cs:spPr>
+    <cs:defRPr sz="900" kern="1200"/>
+  </cs:categoryAxis>
+  <cs:chartArea mods="allowNoFillOverride allowNoLineOverride">
+    <cs:lnRef idx="0"/>
+    <cs:fillRef idx="0"/>
+    <cs:effectRef idx="0"/>
+    <cs:fontRef idx="minor">
+      <a:schemeClr val="tx1"/>
+    </cs:fontRef>
+    <cs:spPr>
+      <a:solidFill>
+        <a:schemeClr val="bg1"/>
+      </a:solidFill>
+      <a:ln w="9525" cap="flat" cmpd="sng" algn="ctr">
+        <a:solidFill>
+          <a:schemeClr val="tx1">
+            <a:lumMod val="15000"/>
+            <a:lumOff val="85000"/>
+          </a:schemeClr>
+        </a:solidFill>
+        <a:round/>
+      </a:ln>
+    </cs:spPr>
+    <cs:defRPr sz="1000" kern="1200"/>
+  </cs:chartArea>
+  <cs:dataLabel>
+    <cs:lnRef idx="0"/>
+    <cs:fillRef idx="0"/>
+    <cs:effectRef idx="0"/>
+    <cs:fontRef idx="minor">
+      <a:schemeClr val="tx1">
+        <a:lumMod val="75000"/>
+        <a:lumOff val="25000"/>
+      </a:schemeClr>
+    </cs:fontRef>
+    <cs:defRPr sz="900" kern="1200"/>
+  </cs:dataLabel>
+  <cs:dataLabelCallout>
+    <cs:lnRef idx="0"/>
+    <cs:fillRef idx="0"/>
+    <cs:effectRef idx="0"/>
+    <cs:fontRef idx="minor">
+      <a:schemeClr val="dk1">
+        <a:lumMod val="65000"/>
+        <a:lumOff val="35000"/>
+      </a:schemeClr>
+    </cs:fontRef>
+    <cs:spPr>
+      <a:solidFill>
+        <a:schemeClr val="lt1"/>
+      </a:solidFill>
+      <a:ln>
+        <a:solidFill>
+          <a:schemeClr val="dk1">
+            <a:lumMod val="25000"/>
+            <a:lumOff val="75000"/>
+          </a:schemeClr>
+        </a:solidFill>
+      </a:ln>
+    </cs:spPr>
+    <cs:defRPr sz="900" kern="1200"/>
+    <cs:bodyPr rot="0" spcFirstLastPara="1" vertOverflow="clip" horzOverflow="clip" vert="horz" wrap="square" lIns="36576" tIns="18288" rIns="36576" bIns="18288" anchor="ctr" anchorCtr="1">
+      <a:spAutoFit/>
+    </cs:bodyPr>
+  </cs:dataLabelCallout>
+  <cs:dataPoint>
+    <cs:lnRef idx="0"/>
+    <cs:fillRef idx="1">
+      <cs:styleClr val="auto"/>
+    </cs:fillRef>
+    <cs:effectRef idx="0"/>
+    <cs:fontRef idx="minor">
+      <a:schemeClr val="tx1"/>
+    </cs:fontRef>
+  </cs:dataPoint>
+  <cs:dataPoint3D>
+    <cs:lnRef idx="0"/>
+    <cs:fillRef idx="1">
+      <cs:styleClr val="auto"/>
+    </cs:fillRef>
+    <cs:effectRef idx="0"/>
+    <cs:fontRef idx="minor">
+      <a:schemeClr val="tx1"/>
+    </cs:fontRef>
+  </cs:dataPoint3D>
+  <cs:dataPointLine>
+    <cs:lnRef idx="0">
+      <cs:styleClr val="auto"/>
+    </cs:lnRef>
+    <cs:fillRef idx="1"/>
+    <cs:effectRef idx="0"/>
+    <cs:fontRef idx="minor">
+      <a:schemeClr val="tx1"/>
+    </cs:fontRef>
+    <cs:spPr>
+      <a:ln w="28575" cap="rnd">
+        <a:solidFill>
+          <a:schemeClr val="phClr"/>
+        </a:solidFill>
+        <a:round/>
+      </a:ln>
+    </cs:spPr>
+  </cs:dataPointLine>
+  <cs:dataPointMarker>
+    <cs:lnRef idx="0">
+      <cs:styleClr val="auto"/>
+    </cs:lnRef>
+    <cs:fillRef idx="1">
+      <cs:styleClr val="auto"/>
+    </cs:fillRef>
+    <cs:effectRef idx="0"/>
+    <cs:fontRef idx="minor">
+      <a:schemeClr val="tx1"/>
+    </cs:fontRef>
+    <cs:spPr>
+      <a:ln w="9525">
+        <a:solidFill>
+          <a:schemeClr val="phClr"/>
+        </a:solidFill>
+      </a:ln>
+    </cs:spPr>
+  </cs:dataPointMarker>
+  <cs:dataPointMarkerLayout symbol="circle" size="5"/>
+  <cs:dataPointWireframe>
+    <cs:lnRef idx="0">
+      <cs:styleClr val="auto"/>
+    </cs:lnRef>
+    <cs:fillRef idx="1"/>
+    <cs:effectRef idx="0"/>
+    <cs:fontRef idx="minor">
+      <a:schemeClr val="tx1"/>
+    </cs:fontRef>
+    <cs:spPr>
+      <a:ln w="9525" cap="rnd">
+        <a:solidFill>
+          <a:schemeClr val="phClr"/>
+        </a:solidFill>
+        <a:round/>
+      </a:ln>
+    </cs:spPr>
+  </cs:dataPointWireframe>
+  <cs:dataTable>
+    <cs:lnRef idx="0"/>
+    <cs:fillRef idx="0"/>
+    <cs:effectRef idx="0"/>
+    <cs:fontRef idx="minor">
+      <a:schemeClr val="tx1">
+        <a:lumMod val="65000"/>
+        <a:lumOff val="35000"/>
+      </a:schemeClr>
+    </cs:fontRef>
+    <cs:spPr>
+      <a:noFill/>
+      <a:ln w="9525" cap="flat" cmpd="sng" algn="ctr">
+        <a:solidFill>
+          <a:schemeClr val="tx1">
+            <a:lumMod val="15000"/>
+            <a:lumOff val="85000"/>
+          </a:schemeClr>
+        </a:solidFill>
+        <a:round/>
+      </a:ln>
+    </cs:spPr>
+    <cs:defRPr sz="900" kern="1200"/>
+  </cs:dataTable>
+  <cs:downBar>
+    <cs:lnRef idx="0"/>
+    <cs:fillRef idx="0"/>
+    <cs:effectRef idx="0"/>
+    <cs:fontRef idx="minor">
+      <a:schemeClr val="dk1"/>
+    </cs:fontRef>
+    <cs:spPr>
+      <a:solidFill>
+        <a:schemeClr val="dk1">
+          <a:lumMod val="65000"/>
+          <a:lumOff val="35000"/>
+        </a:schemeClr>
+      </a:solidFill>
+      <a:ln w="9525">
+        <a:solidFill>
+          <a:schemeClr val="tx1">
+            <a:lumMod val="65000"/>
+            <a:lumOff val="35000"/>
+          </a:schemeClr>
+        </a:solidFill>
+      </a:ln>
+    </cs:spPr>
+  </cs:downBar>
+  <cs:dropLine>
+    <cs:lnRef idx="0"/>
+    <cs:fillRef idx="0"/>
+    <cs:effectRef idx="0"/>
+    <cs:fontRef idx="minor">
+      <a:schemeClr val="tx1"/>
+    </cs:fontRef>
+    <cs:spPr>
+      <a:ln w="9525" cap="flat" cmpd="sng" algn="ctr">
+        <a:solidFill>
+          <a:schemeClr val="tx1">
+            <a:lumMod val="35000"/>
+            <a:lumOff val="65000"/>
+          </a:schemeClr>
+        </a:solidFill>
+        <a:round/>
+      </a:ln>
+    </cs:spPr>
+  </cs:dropLine>
+  <cs:errorBar>
+    <cs:lnRef idx="0"/>
+    <cs:fillRef idx="0"/>
+    <cs:effectRef idx="0"/>
+    <cs:fontRef idx="minor">
+      <a:schemeClr val="tx1"/>
+    </cs:fontRef>
+    <cs:spPr>
+      <a:ln w="9525" cap="flat" cmpd="sng" algn="ctr">
+        <a:solidFill>
+          <a:schemeClr val="tx1">
+            <a:lumMod val="65000"/>
+            <a:lumOff val="35000"/>
+          </a:schemeClr>
+        </a:solidFill>
+        <a:round/>
+      </a:ln>
+    </cs:spPr>
+  </cs:errorBar>
+  <cs:floor>
+    <cs:lnRef idx="0"/>
+    <cs:fillRef idx="0"/>
+    <cs:effectRef idx="0"/>
+    <cs:fontRef idx="minor">
+      <a:schemeClr val="tx1"/>
+    </cs:fontRef>
+    <cs:spPr>
+      <a:noFill/>
+      <a:ln>
+        <a:noFill/>
+      </a:ln>
+    </cs:spPr>
+  </cs:floor>
+  <cs:gridlineMajor>
+    <cs:lnRef idx="0"/>
+    <cs:fillRef idx="0"/>
+    <cs:effectRef idx="0"/>
+    <cs:fontRef idx="minor">
+      <a:schemeClr val="tx1"/>
+    </cs:fontRef>
+    <cs:spPr>
+      <a:ln w="9525" cap="flat" cmpd="sng" algn="ctr">
+        <a:solidFill>
+          <a:schemeClr val="tx1">
+            <a:lumMod val="15000"/>
+            <a:lumOff val="85000"/>
+          </a:schemeClr>
+        </a:solidFill>
+        <a:round/>
+      </a:ln>
+    </cs:spPr>
+  </cs:gridlineMajor>
+  <cs:gridlineMinor>
+    <cs:lnRef idx="0"/>
+    <cs:fillRef idx="0"/>
+    <cs:effectRef idx="0"/>
+    <cs:fontRef idx="minor">
+      <a:schemeClr val="tx1"/>
+    </cs:fontRef>
+    <cs:spPr>
+      <a:ln w="9525" cap="flat" cmpd="sng" algn="ctr">
+        <a:solidFill>
+          <a:schemeClr val="tx1">
+            <a:lumMod val="5000"/>
+            <a:lumOff val="95000"/>
+          </a:schemeClr>
+        </a:solidFill>
+        <a:round/>
+      </a:ln>
+    </cs:spPr>
+  </cs:gridlineMinor>
+  <cs:hiLoLine>
+    <cs:lnRef idx="0"/>
+    <cs:fillRef idx="0"/>
+    <cs:effectRef idx="0"/>
+    <cs:fontRef idx="minor">
+      <a:schemeClr val="tx1"/>
+    </cs:fontRef>
+    <cs:spPr>
+      <a:ln w="9525" cap="flat" cmpd="sng" algn="ctr">
+        <a:solidFill>
+          <a:schemeClr val="tx1">
+            <a:lumMod val="75000"/>
+            <a:lumOff val="25000"/>
+          </a:schemeClr>
+        </a:solidFill>
+        <a:round/>
+      </a:ln>
+    </cs:spPr>
+  </cs:hiLoLine>
+  <cs:leaderLine>
+    <cs:lnRef idx="0"/>
+    <cs:fillRef idx="0"/>
+    <cs:effectRef idx="0"/>
+    <cs:fontRef idx="minor">
+      <a:schemeClr val="tx1"/>
+    </cs:fontRef>
+    <cs:spPr>
+      <a:ln w="9525" cap="flat" cmpd="sng" algn="ctr">
+        <a:solidFill>
+          <a:schemeClr val="tx1">
+            <a:lumMod val="35000"/>
+            <a:lumOff val="65000"/>
+          </a:schemeClr>
+        </a:solidFill>
+        <a:round/>
+      </a:ln>
+    </cs:spPr>
+  </cs:leaderLine>
+  <cs:legend>
+    <cs:lnRef idx="0"/>
+    <cs:fillRef idx="0"/>
+    <cs:effectRef idx="0"/>
+    <cs:fontRef idx="minor">
+      <a:schemeClr val="tx1">
+        <a:lumMod val="65000"/>
+        <a:lumOff val="35000"/>
+      </a:schemeClr>
+    </cs:fontRef>
+    <cs:defRPr sz="900" kern="1200"/>
+  </cs:legend>
+  <cs:plotArea mods="allowNoFillOverride allowNoLineOverride">
+    <cs:lnRef idx="0"/>
+    <cs:fillRef idx="0"/>
+    <cs:effectRef idx="0"/>
+    <cs:fontRef idx="minor">
+      <a:schemeClr val="tx1"/>
+    </cs:fontRef>
+  </cs:plotArea>
+  <cs:plotArea3D mods="allowNoFillOverride allowNoLineOverride">
+    <cs:lnRef idx="0"/>
+    <cs:fillRef idx="0"/>
+    <cs:effectRef idx="0"/>
+    <cs:fontRef idx="minor">
+      <a:schemeClr val="tx1"/>
+    </cs:fontRef>
+  </cs:plotArea3D>
+  <cs:seriesAxis>
+    <cs:lnRef idx="0"/>
+    <cs:fillRef idx="0"/>
+    <cs:effectRef idx="0"/>
+    <cs:fontRef idx="minor">
+      <a:schemeClr val="tx1">
+        <a:lumMod val="65000"/>
+        <a:lumOff val="35000"/>
+      </a:schemeClr>
+    </cs:fontRef>
+    <cs:defRPr sz="900" kern="1200"/>
+  </cs:seriesAxis>
+  <cs:seriesLine>
+    <cs:lnRef idx="0"/>
+    <cs:fillRef idx="0"/>
+    <cs:effectRef idx="0"/>
+    <cs:fontRef idx="minor">
+      <a:schemeClr val="tx1"/>
+    </cs:fontRef>
+    <cs:spPr>
+      <a:ln w="9525" cap="flat" cmpd="sng" algn="ctr">
+        <a:solidFill>
+          <a:schemeClr val="tx1">
+            <a:lumMod val="35000"/>
+            <a:lumOff val="65000"/>
+          </a:schemeClr>
+        </a:solidFill>
+        <a:round/>
+      </a:ln>
+    </cs:spPr>
+  </cs:seriesLine>
+  <cs:title>
+    <cs:lnRef idx="0"/>
+    <cs:fillRef idx="0"/>
+    <cs:effectRef idx="0"/>
+    <cs:fontRef idx="minor">
+      <a:schemeClr val="tx1">
+        <a:lumMod val="65000"/>
+        <a:lumOff val="35000"/>
+      </a:schemeClr>
+    </cs:fontRef>
+    <cs:defRPr sz="1400" b="0" kern="1200" spc="0" baseline="0"/>
+  </cs:title>
+  <cs:trendline>
+    <cs:lnRef idx="0">
+      <cs:styleClr val="auto"/>
+    </cs:lnRef>
+    <cs:fillRef idx="0"/>
+    <cs:effectRef idx="0"/>
+    <cs:fontRef idx="minor">
+      <a:schemeClr val="tx1"/>
+    </cs:fontRef>
+    <cs:spPr>
+      <a:ln w="19050" cap="rnd">
+        <a:solidFill>
+          <a:schemeClr val="phClr"/>
+        </a:solidFill>
+        <a:prstDash val="sysDot"/>
+      </a:ln>
+    </cs:spPr>
+  </cs:trendline>
+  <cs:trendlineLabel>
+    <cs:lnRef idx="0"/>
+    <cs:fillRef idx="0"/>
+    <cs:effectRef idx="0"/>
+    <cs:fontRef idx="minor">
+      <a:schemeClr val="tx1">
+        <a:lumMod val="65000"/>
+        <a:lumOff val="35000"/>
+      </a:schemeClr>
+    </cs:fontRef>
+    <cs:defRPr sz="900" kern="1200"/>
+  </cs:trendlineLabel>
+  <cs:upBar>
+    <cs:lnRef idx="0"/>
+    <cs:fillRef idx="0"/>
+    <cs:effectRef idx="0"/>
+    <cs:fontRef idx="minor">
+      <a:schemeClr val="dk1"/>
+    </cs:fontRef>
+    <cs:spPr>
+      <a:solidFill>
+        <a:schemeClr val="lt1"/>
+      </a:solidFill>
+      <a:ln w="9525">
+        <a:solidFill>
+          <a:schemeClr val="tx1">
+            <a:lumMod val="15000"/>
+            <a:lumOff val="85000"/>
+          </a:schemeClr>
+        </a:solidFill>
+      </a:ln>
+    </cs:spPr>
+  </cs:upBar>
+  <cs:valueAxis>
+    <cs:lnRef idx="0"/>
+    <cs:fillRef idx="0"/>
+    <cs:effectRef idx="0"/>
+    <cs:fontRef idx="minor">
+      <a:schemeClr val="tx1">
+        <a:lumMod val="65000"/>
+        <a:lumOff val="35000"/>
+      </a:schemeClr>
+    </cs:fontRef>
+    <cs:defRPr sz="900" kern="1200"/>
+  </cs:valueAxis>
+  <cs:wall>
+    <cs:lnRef idx="0"/>
+    <cs:fillRef idx="0"/>
+    <cs:effectRef idx="0"/>
+    <cs:fontRef idx="minor">
+      <a:schemeClr val="tx1"/>
+    </cs:fontRef>
+    <cs:spPr>
+      <a:noFill/>
+      <a:ln>
+        <a:noFill/>
+      </a:ln>
+    </cs:spPr>
+  </cs:wall>
+</cs:chartStyle>
+</file>
+
 <file path=word/theme/theme1.xml><?xml version="1.0" encoding="utf-8"?>
 <a:theme xmlns:a="http://schemas.openxmlformats.org/drawingml/2006/main" name="Office Theme">
   <a:themeElements>

</xml_diff>